<commit_message>
Update data model: support block-level incidents
Incidents were modeled as always tied to exactly one TBA/package.
Some incidents (vehicle breakdown, bad weather, ran out of time)
belong to the whole block instead, and can affect zero, one, or
many packages at once.

Changes: incidents now link to block_id directly (no required
package_id); a new incident_packages join table associates an
incident with the specific TBAs it affects, when known. Updated
sections 8, 12, 23, 26, and 27 accordingly, including the Quick
Incident flow (choose Package/TBA vs Whole Block scope) and a note
that a single block-level incident can be cited as the root cause
for several undelivered packages in the generated Amazon response.
</commit_message>
<xml_diff>
--- a/Driver_Incident_Evidence_App_Master_Spec_v1.0.docx
+++ b/Driver_Incident_Evidence_App_Master_Spec_v1.0.docx
@@ -479,7 +479,23 @@
         <w:pStyle w:val="ListBullet"/>
       </w:pPr>
       <w:r>
-        <w:t>One Block can therefore contain many incidents across many packages.</w:t>
+        <w:t>One Block can therefore contain many incidents across many packages, plus incidents that belong to the block itself rather than to any single package.</w:t>
+      </w:r>
+    </w:p>
+    <w:p>
+      <w:pPr>
+        <w:pStyle w:val="ListBullet"/>
+      </w:pPr>
+      <w:r>
+        <w:t>One Block → many Incidents directly (block-level, e.g. vehicle breakdown, severe weather, or running out of time), independent of any specific TBA/package.</w:t>
+      </w:r>
+    </w:p>
+    <w:p>
+      <w:pPr>
+        <w:pStyle w:val="ListBullet"/>
+      </w:pPr>
+      <w:r>
+        <w:t>One Incident → zero, one, or many TBA/package records, via an association, not a single required parent.</w:t>
       </w:r>
     </w:p>
     <w:p>
@@ -718,6 +734,11 @@
       </w:r>
     </w:p>
     <w:p>
+      <w:r>
+        <w:t>An incident can be package-level (tied to one or more specific TBAs) or block-level (e.g. vehicle breakdown, severe weather, or running out of time), affecting the block as a whole rather than any single package. A block-level incident can be enriched later with the specific packages it affected once known, and can be cited as the single root cause behind several undelivered packages when generating an Amazon response (see section 20), instead of requiring a separate incident per TBA.</w:t>
+      </w:r>
+    </w:p>
+    <w:p>
       <w:pPr>
         <w:pStyle w:val="ListBullet"/>
       </w:pPr>
@@ -738,7 +759,7 @@
         <w:pStyle w:val="ListBullet"/>
       </w:pPr>
       <w:r>
-        <w:t>Parent TBA/package</w:t>
+        <w:t>Parent TBA/package(s) — optional; zero, one, or many, via association, not a single required field</w:t>
       </w:r>
     </w:p>
     <w:p>
@@ -1750,7 +1771,7 @@
         <w:pStyle w:val="ListNumber"/>
       </w:pPr>
       <w:r>
-        <w:t>Choose or confirm the TBA, if known; if not known, continue without it.</w:t>
+        <w:t>Choose incident scope: Package/TBA or Whole Block.</w:t>
       </w:r>
     </w:p>
     <w:p>
@@ -1758,6 +1779,14 @@
         <w:pStyle w:val="ListNumber"/>
       </w:pPr>
       <w:r>
+        <w:t>If Package/TBA scope: choose or confirm the TBA, if known; if not known, continue without it. If Whole Block scope: skip TBA selection entirely.</w:t>
+      </w:r>
+    </w:p>
+    <w:p>
+      <w:pPr>
+        <w:pStyle w:val="ListNumber"/>
+      </w:pPr>
+      <w:r>
         <w:t>Tap Record and speak.</w:t>
       </w:r>
     </w:p>
@@ -2004,6 +2033,14 @@
         <w:pStyle w:val="ListBullet"/>
       </w:pPr>
       <w:r>
+        <w:t>incident_packages (join table linking incidents to the TBA/package records they affect)</w:t>
+      </w:r>
+    </w:p>
+    <w:p>
+      <w:pPr>
+        <w:pStyle w:val="ListBullet"/>
+      </w:pPr>
+      <w:r>
         <w:t>communications</w:t>
       </w:r>
     </w:p>
@@ -2053,6 +2090,11 @@
       </w:r>
     </w:p>
     <w:p>
+      <w:r>
+        <w:t>A single block-level incident (e.g. a vehicle breakdown) can be linked to several affected packages through incident_packages, so one root cause explains multiple undelivered TBAs instead of duplicating the incident per package.</w:t>
+      </w:r>
+    </w:p>
+    <w:p>
       <w:pPr>
         <w:pStyle w:val="Heading1"/>
       </w:pPr>
@@ -2322,6 +2364,91 @@
         <w:pStyle w:val="ListBullet"/>
       </w:pPr>
       <w:r>
+        <w:t>block_id</w:t>
+      </w:r>
+    </w:p>
+    <w:p>
+      <w:pPr>
+        <w:pStyle w:val="ListBullet"/>
+      </w:pPr>
+      <w:r>
+        <w:t>category</w:t>
+      </w:r>
+    </w:p>
+    <w:p>
+      <w:pPr>
+        <w:pStyle w:val="ListBullet"/>
+      </w:pPr>
+      <w:r>
+        <w:t>occurred_at</w:t>
+      </w:r>
+    </w:p>
+    <w:p>
+      <w:pPr>
+        <w:pStyle w:val="ListBullet"/>
+      </w:pPr>
+      <w:r>
+        <w:t>transcript</w:t>
+      </w:r>
+    </w:p>
+    <w:p>
+      <w:pPr>
+        <w:pStyle w:val="ListBullet"/>
+      </w:pPr>
+      <w:r>
+        <w:t>structured_summary</w:t>
+      </w:r>
+    </w:p>
+    <w:p>
+      <w:pPr>
+        <w:pStyle w:val="ListBullet"/>
+      </w:pPr>
+      <w:r>
+        <w:t>status</w:t>
+      </w:r>
+    </w:p>
+    <w:p>
+      <w:pPr>
+        <w:pStyle w:val="ListBullet"/>
+      </w:pPr>
+      <w:r>
+        <w:t>created_at</w:t>
+      </w:r>
+    </w:p>
+    <w:p>
+      <w:pPr>
+        <w:pStyle w:val="ListBullet"/>
+      </w:pPr>
+      <w:r>
+        <w:t>updated_at</w:t>
+      </w:r>
+    </w:p>
+    <w:p>
+      <w:r>
+        <w:t>incident_packages:</w:t>
+      </w:r>
+    </w:p>
+    <w:p>
+      <w:pPr>
+        <w:pStyle w:val="ListBullet"/>
+      </w:pPr>
+      <w:r>
+        <w:t>id</w:t>
+      </w:r>
+    </w:p>
+    <w:p>
+      <w:pPr>
+        <w:pStyle w:val="ListBullet"/>
+      </w:pPr>
+      <w:r>
+        <w:t>incident_id</w:t>
+      </w:r>
+    </w:p>
+    <w:p>
+      <w:pPr>
+        <w:pStyle w:val="ListBullet"/>
+      </w:pPr>
+      <w:r>
         <w:t>package_id</w:t>
       </w:r>
     </w:p>
@@ -2330,63 +2457,7 @@
         <w:pStyle w:val="ListBullet"/>
       </w:pPr>
       <w:r>
-        <w:t>block_id</w:t>
-      </w:r>
-    </w:p>
-    <w:p>
-      <w:pPr>
-        <w:pStyle w:val="ListBullet"/>
-      </w:pPr>
-      <w:r>
-        <w:t>category</w:t>
-      </w:r>
-    </w:p>
-    <w:p>
-      <w:pPr>
-        <w:pStyle w:val="ListBullet"/>
-      </w:pPr>
-      <w:r>
-        <w:t>occurred_at</w:t>
-      </w:r>
-    </w:p>
-    <w:p>
-      <w:pPr>
-        <w:pStyle w:val="ListBullet"/>
-      </w:pPr>
-      <w:r>
-        <w:t>transcript</w:t>
-      </w:r>
-    </w:p>
-    <w:p>
-      <w:pPr>
-        <w:pStyle w:val="ListBullet"/>
-      </w:pPr>
-      <w:r>
-        <w:t>structured_summary</w:t>
-      </w:r>
-    </w:p>
-    <w:p>
-      <w:pPr>
-        <w:pStyle w:val="ListBullet"/>
-      </w:pPr>
-      <w:r>
-        <w:t>status</w:t>
-      </w:r>
-    </w:p>
-    <w:p>
-      <w:pPr>
-        <w:pStyle w:val="ListBullet"/>
-      </w:pPr>
-      <w:r>
         <w:t>created_at</w:t>
-      </w:r>
-    </w:p>
-    <w:p>
-      <w:pPr>
-        <w:pStyle w:val="ListBullet"/>
-      </w:pPr>
-      <w:r>
-        <w:t>updated_at</w:t>
       </w:r>
     </w:p>
     <w:p>

</xml_diff>